<commit_message>
menus de complementos UTE
</commit_message>
<xml_diff>
--- a/docs/explicacion_odoo_ute_complementos.docx
+++ b/docs/explicacion_odoo_ute_complementos.docx
@@ -3860,7 +3860,34 @@
         <w:t xml:space="preserve">UTE</w:t>
       </w:r>
       <w:r>
-        <w:t xml:space="preserve">. Dentro de ese menu se agrego:</w:t>
+        <w:t xml:space="preserve">. Los menus del complemento se agregaron directamente al mismo nivel que</w:t>
+      </w:r>
+      <w:r>
+        <w:t xml:space="preserve"> </w:t>
+      </w:r>
+      <w:r>
+        <w:rPr>
+          <w:rStyle w:val="VerbatimChar"/>
+        </w:rPr>
+        <w:t xml:space="preserve">Docentes</w:t>
+      </w:r>
+      <w:r>
+        <w:t xml:space="preserve"> </w:t>
+      </w:r>
+      <w:r>
+        <w:t xml:space="preserve">y</w:t>
+      </w:r>
+      <w:r>
+        <w:t xml:space="preserve"> </w:t>
+      </w:r>
+      <w:r>
+        <w:rPr>
+          <w:rStyle w:val="VerbatimChar"/>
+        </w:rPr>
+        <w:t xml:space="preserve">Materia</w:t>
+      </w:r>
+      <w:r>
+        <w:t xml:space="preserve">, para mantener la estructura original del modulo base:</w:t>
       </w:r>
     </w:p>
     <w:p>
@@ -3880,7 +3907,7 @@
         <w:rPr>
           <w:rStyle w:val="VerbatimChar"/>
         </w:rPr>
-        <w:t xml:space="preserve">└── Complementos Academicos</w:t>
+        <w:t xml:space="preserve">├── Docentes</w:t>
       </w:r>
       <w:r>
         <w:br/>
@@ -3889,7 +3916,7 @@
         <w:rPr>
           <w:rStyle w:val="VerbatimChar"/>
         </w:rPr>
-        <w:t xml:space="preserve">    ├── Planes academicos</w:t>
+        <w:t xml:space="preserve">├── Materia</w:t>
       </w:r>
       <w:r>
         <w:br/>
@@ -3898,7 +3925,7 @@
         <w:rPr>
           <w:rStyle w:val="VerbatimChar"/>
         </w:rPr>
-        <w:t xml:space="preserve">    ├── Aulas</w:t>
+        <w:t xml:space="preserve">├── Planes academicos</w:t>
       </w:r>
       <w:r>
         <w:br/>
@@ -3907,7 +3934,7 @@
         <w:rPr>
           <w:rStyle w:val="VerbatimChar"/>
         </w:rPr>
-        <w:t xml:space="preserve">    ├── Horarios</w:t>
+        <w:t xml:space="preserve">├── Aulas</w:t>
       </w:r>
       <w:r>
         <w:br/>
@@ -3916,7 +3943,7 @@
         <w:rPr>
           <w:rStyle w:val="VerbatimChar"/>
         </w:rPr>
-        <w:t xml:space="preserve">    ├── Asistencias</w:t>
+        <w:t xml:space="preserve">├── Horarios</w:t>
       </w:r>
       <w:r>
         <w:br/>
@@ -3925,7 +3952,16 @@
         <w:rPr>
           <w:rStyle w:val="VerbatimChar"/>
         </w:rPr>
-        <w:t xml:space="preserve">    └── Evaluaciones</w:t>
+        <w:t xml:space="preserve">├── Asistencias</w:t>
+      </w:r>
+      <w:r>
+        <w:br/>
+      </w:r>
+      <w:r>
+        <w:rPr>
+          <w:rStyle w:val="VerbatimChar"/>
+        </w:rPr>
+        <w:t xml:space="preserve">└── Evaluaciones</w:t>
       </w:r>
     </w:p>
     <w:p>

</xml_diff>